<commit_message>
added quiz2 solution and PS 3 solution
</commit_message>
<xml_diff>
--- a/quizzes_exit_tickets/Quiz02/Quiz02_Solution.docx
+++ b/quizzes_exit_tickets/Quiz02/Quiz02_Solution.docx
@@ -277,19 +277,180 @@
       <w:pPr>
         <w:spacing w:after="80"/>
         <w:rPr>
-          <w:b/>
-          <w:bCs/>
+          <w:color w:val="EE0000"/>
         </w:rPr>
       </w:pPr>
-    </w:p>
-    <w:p>
-      <w:pPr>
-        <w:spacing w:after="80"/>
-        <w:rPr>
-          <w:b/>
-          <w:bCs/>
-        </w:rPr>
-      </w:pPr>
+      <m:oMath>
+        <m:r>
+          <w:rPr>
+            <w:rFonts w:ascii="Cambria Math" w:hAnsi="Cambria Math"/>
+            <w:color w:val="EE0000"/>
+          </w:rPr>
+          <m:t>x</m:t>
+        </m:r>
+        <m:d>
+          <m:dPr>
+            <m:begChr m:val="["/>
+            <m:endChr m:val="]"/>
+            <m:ctrlPr>
+              <w:rPr>
+                <w:rFonts w:ascii="Cambria Math" w:hAnsi="Cambria Math"/>
+                <w:i/>
+                <w:color w:val="EE0000"/>
+              </w:rPr>
+            </m:ctrlPr>
+          </m:dPr>
+          <m:e>
+            <m:r>
+              <w:rPr>
+                <w:rFonts w:ascii="Cambria Math" w:hAnsi="Cambria Math"/>
+                <w:color w:val="EE0000"/>
+              </w:rPr>
+              <m:t>n</m:t>
+            </m:r>
+          </m:e>
+        </m:d>
+        <m:r>
+          <w:rPr>
+            <w:rFonts w:ascii="Cambria Math" w:hAnsi="Cambria Math"/>
+            <w:color w:val="EE0000"/>
+          </w:rPr>
+          <m:t>=</m:t>
+        </m:r>
+        <m:sSub>
+          <m:sSubPr>
+            <m:ctrlPr>
+              <w:rPr>
+                <w:rFonts w:ascii="Cambria Math" w:hAnsi="Cambria Math"/>
+                <w:i/>
+                <w:color w:val="EE0000"/>
+              </w:rPr>
+            </m:ctrlPr>
+          </m:sSubPr>
+          <m:e>
+            <m:r>
+              <w:rPr>
+                <w:rFonts w:ascii="Cambria Math" w:hAnsi="Cambria Math"/>
+                <w:color w:val="EE0000"/>
+              </w:rPr>
+              <m:t>x</m:t>
+            </m:r>
+          </m:e>
+          <m:sub>
+            <m:r>
+              <w:rPr>
+                <w:rFonts w:ascii="Cambria Math" w:hAnsi="Cambria Math"/>
+                <w:color w:val="EE0000"/>
+              </w:rPr>
+              <m:t>c</m:t>
+            </m:r>
+          </m:sub>
+        </m:sSub>
+        <m:r>
+          <w:rPr>
+            <w:rFonts w:ascii="Cambria Math" w:hAnsi="Cambria Math"/>
+            <w:color w:val="EE0000"/>
+          </w:rPr>
+          <m:t>(nT)</m:t>
+        </m:r>
+      </m:oMath>
+      <w:r>
+        <w:rPr>
+          <w:rFonts w:eastAsiaTheme="minorEastAsia"/>
+          <w:color w:val="EE0000"/>
+        </w:rPr>
+        <w:t xml:space="preserve">, </w:t>
+      </w:r>
+      <m:oMath>
+        <m:r>
+          <w:rPr>
+            <w:rFonts w:ascii="Cambria Math" w:eastAsiaTheme="minorEastAsia" w:hAnsi="Cambria Math"/>
+            <w:color w:val="EE0000"/>
+          </w:rPr>
+          <m:t>T=1/</m:t>
+        </m:r>
+        <m:sSub>
+          <m:sSubPr>
+            <m:ctrlPr>
+              <w:rPr>
+                <w:rFonts w:ascii="Cambria Math" w:eastAsiaTheme="minorEastAsia" w:hAnsi="Cambria Math"/>
+                <w:i/>
+                <w:color w:val="EE0000"/>
+              </w:rPr>
+            </m:ctrlPr>
+          </m:sSubPr>
+          <m:e>
+            <m:r>
+              <w:rPr>
+                <w:rFonts w:ascii="Cambria Math" w:eastAsiaTheme="minorEastAsia" w:hAnsi="Cambria Math"/>
+                <w:color w:val="EE0000"/>
+              </w:rPr>
+              <m:t>f</m:t>
+            </m:r>
+          </m:e>
+          <m:sub>
+            <m:r>
+              <w:rPr>
+                <w:rFonts w:ascii="Cambria Math" w:eastAsiaTheme="minorEastAsia" w:hAnsi="Cambria Math"/>
+                <w:color w:val="EE0000"/>
+              </w:rPr>
+              <m:t>s</m:t>
+            </m:r>
+          </m:sub>
+        </m:sSub>
+      </m:oMath>
+      <w:r>
+        <w:rPr>
+          <w:rFonts w:eastAsiaTheme="minorEastAsia"/>
+          <w:color w:val="EE0000"/>
+        </w:rPr>
+        <w:t xml:space="preserve"> is sampling period [sec/sample], </w:t>
+      </w:r>
+      <m:oMath>
+        <m:sSub>
+          <m:sSubPr>
+            <m:ctrlPr>
+              <w:rPr>
+                <w:rFonts w:ascii="Cambria Math" w:eastAsiaTheme="minorEastAsia" w:hAnsi="Cambria Math"/>
+                <w:i/>
+                <w:color w:val="EE0000"/>
+              </w:rPr>
+            </m:ctrlPr>
+          </m:sSubPr>
+          <m:e>
+            <m:r>
+              <w:rPr>
+                <w:rFonts w:ascii="Cambria Math" w:eastAsiaTheme="minorEastAsia" w:hAnsi="Cambria Math"/>
+                <w:color w:val="EE0000"/>
+              </w:rPr>
+              <m:t>f</m:t>
+            </m:r>
+          </m:e>
+          <m:sub>
+            <m:r>
+              <w:rPr>
+                <w:rFonts w:ascii="Cambria Math" w:eastAsiaTheme="minorEastAsia" w:hAnsi="Cambria Math"/>
+                <w:color w:val="EE0000"/>
+              </w:rPr>
+              <m:t>s</m:t>
+            </m:r>
+          </m:sub>
+        </m:sSub>
+        <m:r>
+          <w:rPr>
+            <w:rFonts w:ascii="Cambria Math" w:eastAsiaTheme="minorEastAsia" w:hAnsi="Cambria Math"/>
+            <w:color w:val="EE0000"/>
+          </w:rPr>
+          <m:t>=1/T</m:t>
+        </m:r>
+      </m:oMath>
+      <w:r>
+        <w:rPr>
+          <w:rFonts w:eastAsiaTheme="minorEastAsia"/>
+          <w:color w:val="EE0000"/>
+        </w:rPr>
+        <w:t xml:space="preserve"> is sampling rate [samples/sec]</w:t>
+      </w:r>
     </w:p>
     <w:p>
       <w:pPr>
@@ -457,6 +618,439 @@
         <w:spacing w:after="80"/>
         <w:rPr>
           <w:rFonts w:eastAsiaTheme="minorEastAsia"/>
+          <w:color w:val="EE0000"/>
+        </w:rPr>
+      </w:pPr>
+      <m:oMath>
+        <m:sSub>
+          <m:sSubPr>
+            <m:ctrlPr>
+              <w:rPr>
+                <w:rFonts w:ascii="Cambria Math" w:eastAsiaTheme="minorEastAsia" w:hAnsi="Cambria Math"/>
+                <w:i/>
+                <w:color w:val="EE0000"/>
+              </w:rPr>
+            </m:ctrlPr>
+          </m:sSubPr>
+          <m:e>
+            <m:r>
+              <w:rPr>
+                <w:rFonts w:ascii="Cambria Math" w:eastAsiaTheme="minorEastAsia" w:hAnsi="Cambria Math"/>
+                <w:color w:val="EE0000"/>
+              </w:rPr>
+              <m:t>X</m:t>
+            </m:r>
+          </m:e>
+          <m:sub>
+            <m:r>
+              <w:rPr>
+                <w:rFonts w:ascii="Cambria Math" w:eastAsiaTheme="minorEastAsia" w:hAnsi="Cambria Math"/>
+                <w:color w:val="EE0000"/>
+              </w:rPr>
+              <m:t>s</m:t>
+            </m:r>
+          </m:sub>
+        </m:sSub>
+        <m:d>
+          <m:dPr>
+            <m:ctrlPr>
+              <w:rPr>
+                <w:rFonts w:ascii="Cambria Math" w:eastAsiaTheme="minorEastAsia" w:hAnsi="Cambria Math"/>
+                <w:i/>
+                <w:color w:val="EE0000"/>
+              </w:rPr>
+            </m:ctrlPr>
+          </m:dPr>
+          <m:e>
+            <m:r>
+              <w:rPr>
+                <w:rFonts w:ascii="Cambria Math" w:eastAsiaTheme="minorEastAsia" w:hAnsi="Cambria Math"/>
+                <w:color w:val="EE0000"/>
+              </w:rPr>
+              <m:t>j</m:t>
+            </m:r>
+            <m:r>
+              <m:rPr>
+                <m:sty m:val="p"/>
+              </m:rPr>
+              <w:rPr>
+                <w:rFonts w:ascii="Cambria Math" w:eastAsiaTheme="minorEastAsia" w:hAnsi="Cambria Math"/>
+                <w:color w:val="EE0000"/>
+              </w:rPr>
+              <m:t>Ω</m:t>
+            </m:r>
+          </m:e>
+        </m:d>
+        <m:r>
+          <w:rPr>
+            <w:rFonts w:ascii="Cambria Math" w:eastAsiaTheme="minorEastAsia" w:hAnsi="Cambria Math"/>
+            <w:color w:val="EE0000"/>
+          </w:rPr>
+          <m:t>=</m:t>
+        </m:r>
+        <m:f>
+          <m:fPr>
+            <m:ctrlPr>
+              <w:rPr>
+                <w:rFonts w:ascii="Cambria Math" w:eastAsiaTheme="minorEastAsia" w:hAnsi="Cambria Math"/>
+                <w:i/>
+                <w:color w:val="EE0000"/>
+              </w:rPr>
+            </m:ctrlPr>
+          </m:fPr>
+          <m:num>
+            <m:r>
+              <w:rPr>
+                <w:rFonts w:ascii="Cambria Math" w:eastAsiaTheme="minorEastAsia" w:hAnsi="Cambria Math"/>
+                <w:color w:val="EE0000"/>
+              </w:rPr>
+              <m:t>1</m:t>
+            </m:r>
+          </m:num>
+          <m:den>
+            <m:r>
+              <w:rPr>
+                <w:rFonts w:ascii="Cambria Math" w:eastAsiaTheme="minorEastAsia" w:hAnsi="Cambria Math"/>
+                <w:color w:val="EE0000"/>
+              </w:rPr>
+              <m:t>T</m:t>
+            </m:r>
+          </m:den>
+        </m:f>
+        <m:nary>
+          <m:naryPr>
+            <m:chr m:val="∑"/>
+            <m:limLoc m:val="subSup"/>
+            <m:supHide m:val="1"/>
+            <m:ctrlPr>
+              <w:rPr>
+                <w:rFonts w:ascii="Cambria Math" w:eastAsiaTheme="minorEastAsia" w:hAnsi="Cambria Math"/>
+                <w:i/>
+                <w:color w:val="EE0000"/>
+              </w:rPr>
+            </m:ctrlPr>
+          </m:naryPr>
+          <m:sub>
+            <m:r>
+              <w:rPr>
+                <w:rFonts w:ascii="Cambria Math" w:eastAsiaTheme="minorEastAsia" w:hAnsi="Cambria Math"/>
+                <w:color w:val="EE0000"/>
+              </w:rPr>
+              <m:t>k</m:t>
+            </m:r>
+          </m:sub>
+          <m:sup/>
+          <m:e>
+            <m:sSub>
+              <m:sSubPr>
+                <m:ctrlPr>
+                  <w:rPr>
+                    <w:rFonts w:ascii="Cambria Math" w:eastAsiaTheme="minorEastAsia" w:hAnsi="Cambria Math"/>
+                    <w:i/>
+                    <w:color w:val="EE0000"/>
+                  </w:rPr>
+                </m:ctrlPr>
+              </m:sSubPr>
+              <m:e>
+                <m:r>
+                  <w:rPr>
+                    <w:rFonts w:ascii="Cambria Math" w:eastAsiaTheme="minorEastAsia" w:hAnsi="Cambria Math"/>
+                    <w:color w:val="EE0000"/>
+                  </w:rPr>
+                  <m:t>X</m:t>
+                </m:r>
+              </m:e>
+              <m:sub>
+                <m:r>
+                  <w:rPr>
+                    <w:rFonts w:ascii="Cambria Math" w:eastAsiaTheme="minorEastAsia" w:hAnsi="Cambria Math"/>
+                    <w:color w:val="EE0000"/>
+                  </w:rPr>
+                  <m:t>c</m:t>
+                </m:r>
+              </m:sub>
+            </m:sSub>
+            <m:r>
+              <w:rPr>
+                <w:rFonts w:ascii="Cambria Math" w:eastAsiaTheme="minorEastAsia" w:hAnsi="Cambria Math"/>
+                <w:color w:val="EE0000"/>
+              </w:rPr>
+              <m:t>(j</m:t>
+            </m:r>
+            <m:d>
+              <m:dPr>
+                <m:ctrlPr>
+                  <w:rPr>
+                    <w:rFonts w:ascii="Cambria Math" w:eastAsiaTheme="minorEastAsia" w:hAnsi="Cambria Math"/>
+                    <w:i/>
+                    <w:color w:val="EE0000"/>
+                  </w:rPr>
+                </m:ctrlPr>
+              </m:dPr>
+              <m:e>
+                <m:r>
+                  <m:rPr>
+                    <m:sty m:val="p"/>
+                  </m:rPr>
+                  <w:rPr>
+                    <w:rFonts w:ascii="Cambria Math" w:eastAsiaTheme="minorEastAsia" w:hAnsi="Cambria Math"/>
+                    <w:color w:val="EE0000"/>
+                  </w:rPr>
+                  <m:t>Ω</m:t>
+                </m:r>
+                <m:r>
+                  <w:rPr>
+                    <w:rFonts w:ascii="Cambria Math" w:eastAsiaTheme="minorEastAsia" w:hAnsi="Cambria Math"/>
+                    <w:color w:val="EE0000"/>
+                  </w:rPr>
+                  <m:t>-k</m:t>
+                </m:r>
+                <m:sSub>
+                  <m:sSubPr>
+                    <m:ctrlPr>
+                      <w:rPr>
+                        <w:rFonts w:ascii="Cambria Math" w:eastAsiaTheme="minorEastAsia" w:hAnsi="Cambria Math"/>
+                        <w:i/>
+                        <w:color w:val="EE0000"/>
+                      </w:rPr>
+                    </m:ctrlPr>
+                  </m:sSubPr>
+                  <m:e>
+                    <m:r>
+                      <m:rPr>
+                        <m:sty m:val="p"/>
+                      </m:rPr>
+                      <w:rPr>
+                        <w:rFonts w:ascii="Cambria Math" w:eastAsiaTheme="minorEastAsia" w:hAnsi="Cambria Math"/>
+                        <w:color w:val="EE0000"/>
+                      </w:rPr>
+                      <m:t>Ω</m:t>
+                    </m:r>
+                    <m:ctrlPr>
+                      <w:rPr>
+                        <w:rFonts w:ascii="Cambria Math" w:eastAsiaTheme="minorEastAsia" w:hAnsi="Cambria Math"/>
+                        <w:color w:val="EE0000"/>
+                      </w:rPr>
+                    </m:ctrlPr>
+                  </m:e>
+                  <m:sub>
+                    <m:r>
+                      <w:rPr>
+                        <w:rFonts w:ascii="Cambria Math" w:eastAsiaTheme="minorEastAsia" w:hAnsi="Cambria Math"/>
+                        <w:color w:val="EE0000"/>
+                      </w:rPr>
+                      <m:t>s</m:t>
+                    </m:r>
+                  </m:sub>
+                </m:sSub>
+              </m:e>
+            </m:d>
+            <m:r>
+              <w:rPr>
+                <w:rFonts w:ascii="Cambria Math" w:eastAsiaTheme="minorEastAsia" w:hAnsi="Cambria Math"/>
+                <w:color w:val="EE0000"/>
+              </w:rPr>
+              <m:t>)</m:t>
+            </m:r>
+          </m:e>
+        </m:nary>
+      </m:oMath>
+      <w:r>
+        <w:rPr>
+          <w:rFonts w:eastAsiaTheme="minorEastAsia"/>
+          <w:color w:val="EE0000"/>
+        </w:rPr>
+        <w:t xml:space="preserve">, replication of </w:t>
+      </w:r>
+      <m:oMath>
+        <m:sSub>
+          <m:sSubPr>
+            <m:ctrlPr>
+              <w:rPr>
+                <w:rFonts w:ascii="Cambria Math" w:eastAsiaTheme="minorEastAsia" w:hAnsi="Cambria Math"/>
+                <w:i/>
+                <w:color w:val="EE0000"/>
+              </w:rPr>
+            </m:ctrlPr>
+          </m:sSubPr>
+          <m:e>
+            <m:r>
+              <w:rPr>
+                <w:rFonts w:ascii="Cambria Math" w:eastAsiaTheme="minorEastAsia" w:hAnsi="Cambria Math"/>
+                <w:color w:val="EE0000"/>
+              </w:rPr>
+              <m:t>X</m:t>
+            </m:r>
+          </m:e>
+          <m:sub>
+            <m:r>
+              <w:rPr>
+                <w:rFonts w:ascii="Cambria Math" w:eastAsiaTheme="minorEastAsia" w:hAnsi="Cambria Math"/>
+                <w:color w:val="EE0000"/>
+              </w:rPr>
+              <m:t>c</m:t>
+            </m:r>
+          </m:sub>
+        </m:sSub>
+        <m:r>
+          <w:rPr>
+            <w:rFonts w:ascii="Cambria Math" w:eastAsiaTheme="minorEastAsia" w:hAnsi="Cambria Math"/>
+            <w:color w:val="EE0000"/>
+          </w:rPr>
+          <m:t>(j</m:t>
+        </m:r>
+        <m:r>
+          <m:rPr>
+            <m:sty m:val="p"/>
+          </m:rPr>
+          <w:rPr>
+            <w:rFonts w:ascii="Cambria Math" w:eastAsiaTheme="minorEastAsia" w:hAnsi="Cambria Math"/>
+            <w:color w:val="EE0000"/>
+          </w:rPr>
+          <m:t>Ω</m:t>
+        </m:r>
+        <m:r>
+          <w:rPr>
+            <w:rFonts w:ascii="Cambria Math" w:eastAsiaTheme="minorEastAsia" w:hAnsi="Cambria Math"/>
+            <w:color w:val="EE0000"/>
+          </w:rPr>
+          <m:t>)</m:t>
+        </m:r>
+      </m:oMath>
+      <w:r>
+        <w:rPr>
+          <w:rFonts w:eastAsiaTheme="minorEastAsia"/>
+          <w:color w:val="EE0000"/>
+        </w:rPr>
+        <w:t xml:space="preserve"> at multiples of </w:t>
+      </w:r>
+      <m:oMath>
+        <m:sSub>
+          <m:sSubPr>
+            <m:ctrlPr>
+              <w:rPr>
+                <w:rFonts w:ascii="Cambria Math" w:eastAsiaTheme="minorEastAsia" w:hAnsi="Cambria Math"/>
+                <w:i/>
+                <w:color w:val="EE0000"/>
+              </w:rPr>
+            </m:ctrlPr>
+          </m:sSubPr>
+          <m:e>
+            <m:r>
+              <m:rPr>
+                <m:sty m:val="p"/>
+              </m:rPr>
+              <w:rPr>
+                <w:rFonts w:ascii="Cambria Math" w:eastAsiaTheme="minorEastAsia" w:hAnsi="Cambria Math"/>
+                <w:color w:val="EE0000"/>
+              </w:rPr>
+              <m:t>Ω</m:t>
+            </m:r>
+            <m:ctrlPr>
+              <w:rPr>
+                <w:rFonts w:ascii="Cambria Math" w:eastAsiaTheme="minorEastAsia" w:hAnsi="Cambria Math"/>
+                <w:color w:val="EE0000"/>
+              </w:rPr>
+            </m:ctrlPr>
+          </m:e>
+          <m:sub>
+            <m:r>
+              <w:rPr>
+                <w:rFonts w:ascii="Cambria Math" w:eastAsiaTheme="minorEastAsia" w:hAnsi="Cambria Math"/>
+                <w:color w:val="EE0000"/>
+              </w:rPr>
+              <m:t>s</m:t>
+            </m:r>
+          </m:sub>
+        </m:sSub>
+        <m:r>
+          <w:rPr>
+            <w:rFonts w:ascii="Cambria Math" w:eastAsiaTheme="minorEastAsia" w:hAnsi="Cambria Math"/>
+            <w:color w:val="EE0000"/>
+          </w:rPr>
+          <m:t>=</m:t>
+        </m:r>
+        <m:f>
+          <m:fPr>
+            <m:ctrlPr>
+              <w:rPr>
+                <w:rFonts w:ascii="Cambria Math" w:eastAsiaTheme="minorEastAsia" w:hAnsi="Cambria Math"/>
+                <w:i/>
+                <w:color w:val="EE0000"/>
+              </w:rPr>
+            </m:ctrlPr>
+          </m:fPr>
+          <m:num>
+            <m:r>
+              <w:rPr>
+                <w:rFonts w:ascii="Cambria Math" w:eastAsiaTheme="minorEastAsia" w:hAnsi="Cambria Math"/>
+                <w:color w:val="EE0000"/>
+              </w:rPr>
+              <m:t>2π</m:t>
+            </m:r>
+          </m:num>
+          <m:den>
+            <m:r>
+              <w:rPr>
+                <w:rFonts w:ascii="Cambria Math" w:eastAsiaTheme="minorEastAsia" w:hAnsi="Cambria Math"/>
+                <w:color w:val="EE0000"/>
+              </w:rPr>
+              <m:t>T</m:t>
+            </m:r>
+          </m:den>
+        </m:f>
+      </m:oMath>
+      <w:r>
+        <w:rPr>
+          <w:rFonts w:eastAsiaTheme="minorEastAsia"/>
+          <w:color w:val="EE0000"/>
+        </w:rPr>
+        <w:t xml:space="preserve"> and scaling by </w:t>
+      </w:r>
+      <m:oMath>
+        <m:f>
+          <m:fPr>
+            <m:ctrlPr>
+              <w:rPr>
+                <w:rFonts w:ascii="Cambria Math" w:eastAsiaTheme="minorEastAsia" w:hAnsi="Cambria Math"/>
+                <w:i/>
+                <w:color w:val="EE0000"/>
+              </w:rPr>
+            </m:ctrlPr>
+          </m:fPr>
+          <m:num>
+            <m:r>
+              <w:rPr>
+                <w:rFonts w:ascii="Cambria Math" w:eastAsiaTheme="minorEastAsia" w:hAnsi="Cambria Math"/>
+                <w:color w:val="EE0000"/>
+              </w:rPr>
+              <m:t>1</m:t>
+            </m:r>
+          </m:num>
+          <m:den>
+            <m:r>
+              <w:rPr>
+                <w:rFonts w:ascii="Cambria Math" w:eastAsiaTheme="minorEastAsia" w:hAnsi="Cambria Math"/>
+                <w:color w:val="EE0000"/>
+              </w:rPr>
+              <m:t>T</m:t>
+            </m:r>
+          </m:den>
+        </m:f>
+      </m:oMath>
+      <w:r>
+        <w:rPr>
+          <w:rFonts w:eastAsiaTheme="minorEastAsia"/>
+          <w:color w:val="EE0000"/>
+        </w:rPr>
+        <w:t>.</w:t>
+      </w:r>
+    </w:p>
+    <w:p>
+      <w:pPr>
+        <w:spacing w:after="80"/>
+        <w:rPr>
+          <w:rFonts w:eastAsiaTheme="minorEastAsia"/>
         </w:rPr>
       </w:pPr>
     </w:p>
@@ -464,14 +1058,6 @@
       <w:pPr>
         <w:spacing w:after="80"/>
         <w:rPr>
-          <w:rFonts w:eastAsiaTheme="minorEastAsia"/>
-        </w:rPr>
-      </w:pPr>
-    </w:p>
-    <w:p>
-      <w:pPr>
-        <w:spacing w:after="80"/>
-        <w:rPr>
           <w:b/>
           <w:bCs/>
         </w:rPr>
@@ -514,17 +1100,17 @@
         <w:rPr>
           <w:b/>
           <w:bCs/>
+          <w:color w:val="EE0000"/>
         </w:rPr>
       </w:pPr>
-    </w:p>
-    <w:p>
-      <w:pPr>
-        <w:spacing w:after="80"/>
+      <w:r>
         <w:rPr>
           <w:b/>
           <w:bCs/>
-        </w:rPr>
-      </w:pPr>
+          <w:color w:val="EE0000"/>
+        </w:rPr>
+        <w:t>3 kHz</w:t>
+      </w:r>
     </w:p>
     <w:p>
       <w:pPr>
@@ -631,6 +1217,125 @@
         <w:rPr>
           <w:rFonts w:eastAsiaTheme="minorEastAsia" w:cstheme="minorHAnsi"/>
           <w:bCs/>
+          <w:color w:val="EE0000"/>
+        </w:rPr>
+      </w:pPr>
+      <w:r>
+        <w:rPr>
+          <w:rFonts w:eastAsiaTheme="minorEastAsia" w:cstheme="minorHAnsi"/>
+          <w:bCs/>
+          <w:color w:val="EE0000"/>
+        </w:rPr>
+        <w:t xml:space="preserve">Nyquist rate is </w:t>
+      </w:r>
+      <m:oMath>
+        <m:r>
+          <w:rPr>
+            <w:rFonts w:ascii="Cambria Math" w:eastAsiaTheme="minorEastAsia" w:hAnsi="Cambria Math" w:cstheme="minorHAnsi"/>
+            <w:color w:val="EE0000"/>
+          </w:rPr>
+          <m:t>2</m:t>
+        </m:r>
+        <m:sSub>
+          <m:sSubPr>
+            <m:ctrlPr>
+              <w:rPr>
+                <w:rFonts w:ascii="Cambria Math" w:eastAsiaTheme="minorEastAsia" w:hAnsi="Cambria Math" w:cstheme="minorHAnsi"/>
+                <w:bCs/>
+                <w:i/>
+                <w:color w:val="EE0000"/>
+              </w:rPr>
+            </m:ctrlPr>
+          </m:sSubPr>
+          <m:e>
+            <m:r>
+              <w:rPr>
+                <w:rFonts w:ascii="Cambria Math" w:eastAsiaTheme="minorEastAsia" w:hAnsi="Cambria Math" w:cstheme="minorHAnsi"/>
+                <w:color w:val="EE0000"/>
+              </w:rPr>
+              <m:t>f</m:t>
+            </m:r>
+          </m:e>
+          <m:sub>
+            <m:r>
+              <w:rPr>
+                <w:rFonts w:ascii="Cambria Math" w:eastAsiaTheme="minorEastAsia" w:hAnsi="Cambria Math" w:cstheme="minorHAnsi"/>
+                <w:color w:val="EE0000"/>
+              </w:rPr>
+              <m:t>M</m:t>
+            </m:r>
+          </m:sub>
+        </m:sSub>
+        <m:r>
+          <w:rPr>
+            <w:rFonts w:ascii="Cambria Math" w:eastAsiaTheme="minorEastAsia" w:hAnsi="Cambria Math" w:cstheme="minorHAnsi"/>
+            <w:color w:val="EE0000"/>
+          </w:rPr>
+          <m:t>=9</m:t>
+        </m:r>
+      </m:oMath>
+      <w:r>
+        <w:rPr>
+          <w:rFonts w:eastAsiaTheme="minorEastAsia" w:cstheme="minorHAnsi"/>
+          <w:bCs/>
+          <w:color w:val="EE0000"/>
+        </w:rPr>
+        <w:t xml:space="preserve"> kHz here. </w:t>
+      </w:r>
+      <m:oMath>
+        <m:sSub>
+          <m:sSubPr>
+            <m:ctrlPr>
+              <w:rPr>
+                <w:rFonts w:ascii="Cambria Math" w:eastAsiaTheme="minorEastAsia" w:hAnsi="Cambria Math" w:cstheme="minorHAnsi"/>
+                <w:bCs/>
+                <w:i/>
+                <w:color w:val="EE0000"/>
+              </w:rPr>
+            </m:ctrlPr>
+          </m:sSubPr>
+          <m:e>
+            <m:r>
+              <w:rPr>
+                <w:rFonts w:ascii="Cambria Math" w:eastAsiaTheme="minorEastAsia" w:hAnsi="Cambria Math" w:cstheme="minorHAnsi"/>
+                <w:color w:val="EE0000"/>
+              </w:rPr>
+              <m:t>f</m:t>
+            </m:r>
+          </m:e>
+          <m:sub>
+            <m:r>
+              <w:rPr>
+                <w:rFonts w:ascii="Cambria Math" w:eastAsiaTheme="minorEastAsia" w:hAnsi="Cambria Math" w:cstheme="minorHAnsi"/>
+                <w:color w:val="EE0000"/>
+              </w:rPr>
+              <m:t>s</m:t>
+            </m:r>
+          </m:sub>
+        </m:sSub>
+        <m:r>
+          <w:rPr>
+            <w:rFonts w:ascii="Cambria Math" w:eastAsiaTheme="minorEastAsia" w:hAnsi="Cambria Math" w:cstheme="minorHAnsi"/>
+            <w:color w:val="EE0000"/>
+          </w:rPr>
+          <m:t>=8</m:t>
+        </m:r>
+      </m:oMath>
+      <w:r>
+        <w:rPr>
+          <w:rFonts w:eastAsiaTheme="minorEastAsia" w:cstheme="minorHAnsi"/>
+          <w:bCs/>
+          <w:color w:val="EE0000"/>
+        </w:rPr>
+        <w:t xml:space="preserve"> kHz is less than 9 kHz and not sufficient.</w:t>
+      </w:r>
+    </w:p>
+    <w:p>
+      <w:pPr>
+        <w:spacing w:after="80"/>
+        <w:rPr>
+          <w:rFonts w:eastAsiaTheme="minorEastAsia" w:cstheme="minorHAnsi"/>
+          <w:bCs/>
         </w:rPr>
       </w:pPr>
     </w:p>
@@ -639,6 +1344,152 @@
         <w:spacing w:after="80"/>
         <w:rPr>
           <w:rFonts w:eastAsiaTheme="minorEastAsia" w:cstheme="minorHAnsi"/>
+          <w:b/>
+        </w:rPr>
+      </w:pPr>
+      <w:r>
+        <w:rPr>
+          <w:rFonts w:eastAsiaTheme="minorEastAsia" w:cstheme="minorHAnsi"/>
+          <w:b/>
+        </w:rPr>
+        <w:t>5</w:t>
+      </w:r>
+      <w:r>
+        <w:rPr>
+          <w:rFonts w:eastAsiaTheme="minorEastAsia" w:cstheme="minorHAnsi"/>
+          <w:b/>
+        </w:rPr>
+        <w:t xml:space="preserve">. </w:t>
+      </w:r>
+      <w:r>
+        <w:rPr>
+          <w:rFonts w:eastAsiaTheme="minorEastAsia" w:cstheme="minorHAnsi"/>
+          <w:b/>
+        </w:rPr>
+        <w:t>D/A concept</w:t>
+      </w:r>
+    </w:p>
+    <w:p>
+      <w:pPr>
+        <w:spacing w:after="80"/>
+        <w:rPr>
+          <w:rFonts w:eastAsiaTheme="minorEastAsia" w:cstheme="minorHAnsi"/>
+          <w:bCs/>
+        </w:rPr>
+      </w:pPr>
+      <w:r>
+        <w:rPr>
+          <w:rFonts w:eastAsiaTheme="minorEastAsia" w:cstheme="minorHAnsi"/>
+          <w:bCs/>
+        </w:rPr>
+        <w:t>What frequency-domain magnitude effect is introduced by a zero-order hold?</w:t>
+      </w:r>
+    </w:p>
+    <w:p>
+      <w:pPr>
+        <w:spacing w:after="80"/>
+        <w:rPr>
+          <w:rFonts w:eastAsiaTheme="minorEastAsia" w:cstheme="minorHAnsi"/>
+          <w:bCs/>
+          <w:color w:val="EE0000"/>
+        </w:rPr>
+      </w:pPr>
+      <w:proofErr w:type="spellStart"/>
+      <w:r>
+        <w:rPr>
+          <w:rFonts w:eastAsiaTheme="minorEastAsia" w:cstheme="minorHAnsi"/>
+          <w:bCs/>
+          <w:color w:val="EE0000"/>
+        </w:rPr>
+        <w:t>sinc</w:t>
+      </w:r>
+      <w:proofErr w:type="spellEnd"/>
+      <w:r>
+        <w:rPr>
+          <w:rFonts w:eastAsiaTheme="minorEastAsia" w:cstheme="minorHAnsi"/>
+          <w:bCs/>
+          <w:color w:val="EE0000"/>
+        </w:rPr>
+        <w:t xml:space="preserve">-shaped high frequency droop (-3.92 dB at </w:t>
+      </w:r>
+      <m:oMath>
+        <m:sSub>
+          <m:sSubPr>
+            <m:ctrlPr>
+              <w:rPr>
+                <w:rFonts w:ascii="Cambria Math" w:eastAsiaTheme="minorEastAsia" w:hAnsi="Cambria Math" w:cstheme="minorHAnsi"/>
+                <w:bCs/>
+                <w:i/>
+                <w:color w:val="EE0000"/>
+              </w:rPr>
+            </m:ctrlPr>
+          </m:sSubPr>
+          <m:e>
+            <m:r>
+              <w:rPr>
+                <w:rFonts w:ascii="Cambria Math" w:eastAsiaTheme="minorEastAsia" w:hAnsi="Cambria Math" w:cstheme="minorHAnsi"/>
+                <w:color w:val="EE0000"/>
+              </w:rPr>
+              <m:t>f</m:t>
+            </m:r>
+          </m:e>
+          <m:sub>
+            <m:r>
+              <w:rPr>
+                <w:rFonts w:ascii="Cambria Math" w:eastAsiaTheme="minorEastAsia" w:hAnsi="Cambria Math" w:cstheme="minorHAnsi"/>
+                <w:color w:val="EE0000"/>
+              </w:rPr>
+              <m:t>s</m:t>
+            </m:r>
+          </m:sub>
+        </m:sSub>
+        <m:r>
+          <w:rPr>
+            <w:rFonts w:ascii="Cambria Math" w:eastAsiaTheme="minorEastAsia" w:hAnsi="Cambria Math" w:cstheme="minorHAnsi"/>
+            <w:color w:val="EE0000"/>
+          </w:rPr>
+          <m:t>/2</m:t>
+        </m:r>
+      </m:oMath>
+      <w:r>
+        <w:rPr>
+          <w:rFonts w:eastAsiaTheme="minorEastAsia" w:cstheme="minorHAnsi"/>
+          <w:bCs/>
+          <w:color w:val="EE0000"/>
+        </w:rPr>
+        <w:t xml:space="preserve">) and time delay by </w:t>
+      </w:r>
+      <m:oMath>
+        <m:r>
+          <w:rPr>
+            <w:rFonts w:ascii="Cambria Math" w:eastAsiaTheme="minorEastAsia" w:hAnsi="Cambria Math" w:cstheme="minorHAnsi"/>
+            <w:color w:val="EE0000"/>
+          </w:rPr>
+          <m:t>T/2</m:t>
+        </m:r>
+      </m:oMath>
+      <w:r>
+        <w:rPr>
+          <w:rFonts w:eastAsiaTheme="minorEastAsia" w:cstheme="minorHAnsi"/>
+          <w:bCs/>
+          <w:color w:val="EE0000"/>
+        </w:rPr>
+        <w:t>.</w:t>
+      </w:r>
+      <w:r>
+        <w:rPr>
+          <w:rFonts w:eastAsiaTheme="minorEastAsia" w:cstheme="minorHAnsi"/>
+          <w:bCs/>
+          <w:color w:val="EE0000"/>
+        </w:rPr>
+        <w:t xml:space="preserve"> </w:t>
+      </w:r>
+    </w:p>
+    <w:p>
+      <w:pPr>
+        <w:spacing w:after="80"/>
+        <w:rPr>
+          <w:rFonts w:eastAsiaTheme="minorEastAsia" w:cstheme="minorHAnsi"/>
           <w:bCs/>
         </w:rPr>
       </w:pPr>
@@ -647,117 +1498,97 @@
       <w:pPr>
         <w:spacing w:after="80"/>
         <w:rPr>
+          <w:b/>
+          <w:sz w:val="23"/>
+        </w:rPr>
+      </w:pPr>
+      <w:r>
+        <w:rPr>
           <w:rFonts w:eastAsiaTheme="minorEastAsia" w:cstheme="minorHAnsi"/>
           <w:b/>
         </w:rPr>
-      </w:pPr>
+        <w:t>6</w:t>
+      </w:r>
       <w:r>
         <w:rPr>
           <w:rFonts w:eastAsiaTheme="minorEastAsia" w:cstheme="minorHAnsi"/>
           <w:b/>
         </w:rPr>
-        <w:t>5</w:t>
-      </w:r>
-      <w:r>
-        <w:rPr>
-          <w:rFonts w:eastAsiaTheme="minorEastAsia" w:cstheme="minorHAnsi"/>
+        <w:t xml:space="preserve">. </w:t>
+      </w:r>
+      <w:r>
+        <w:rPr>
           <w:b/>
-        </w:rPr>
-        <w:t xml:space="preserve">. </w:t>
-      </w:r>
-      <w:r>
-        <w:rPr>
-          <w:rFonts w:eastAsiaTheme="minorEastAsia" w:cstheme="minorHAnsi"/>
-          <w:b/>
-        </w:rPr>
-        <w:t>D/A concept</w:t>
+          <w:sz w:val="23"/>
+        </w:rPr>
+        <w:t>Quantization</w:t>
       </w:r>
     </w:p>
     <w:p>
       <w:pPr>
         <w:spacing w:after="80"/>
         <w:rPr>
-          <w:rFonts w:eastAsiaTheme="minorEastAsia" w:cstheme="minorHAnsi"/>
-          <w:bCs/>
+          <w:bCs/>
+          <w:sz w:val="23"/>
         </w:rPr>
       </w:pPr>
       <w:r>
         <w:rPr>
-          <w:rFonts w:eastAsiaTheme="minorEastAsia" w:cstheme="minorHAnsi"/>
-          <w:bCs/>
-        </w:rPr>
-        <w:t>What frequency-domain magnitude effect is introduced by a zero-order hold?</w:t>
+          <w:bCs/>
+          <w:sz w:val="23"/>
+        </w:rPr>
+        <w:t>Estimate the ideal full-scale sine SQNR</w:t>
+      </w:r>
+      <w:r>
+        <w:rPr>
+          <w:bCs/>
+          <w:sz w:val="23"/>
+        </w:rPr>
+        <w:t xml:space="preserve"> in dB</w:t>
+      </w:r>
+      <w:r>
+        <w:rPr>
+          <w:bCs/>
+          <w:sz w:val="23"/>
+        </w:rPr>
+        <w:t xml:space="preserve"> for a 10-bit uniform quantizer.</w:t>
       </w:r>
     </w:p>
     <w:p>
       <w:pPr>
         <w:spacing w:after="80"/>
         <w:rPr>
-          <w:rFonts w:eastAsiaTheme="minorEastAsia" w:cstheme="minorHAnsi"/>
-          <w:bCs/>
+          <w:bCs/>
+          <w:color w:val="EE0000"/>
+          <w:sz w:val="23"/>
         </w:rPr>
       </w:pPr>
-      <w:r>
-        <w:rPr>
-          <w:rFonts w:eastAsiaTheme="minorEastAsia" w:cstheme="minorHAnsi"/>
-          <w:bCs/>
-        </w:rPr>
-        <w:t xml:space="preserve"> </w:t>
-      </w:r>
-    </w:p>
-    <w:p>
-      <w:pPr>
-        <w:spacing w:after="80"/>
-        <w:rPr>
-          <w:rFonts w:eastAsiaTheme="minorEastAsia" w:cstheme="minorHAnsi"/>
-          <w:bCs/>
-        </w:rPr>
-      </w:pPr>
-    </w:p>
-    <w:p>
-      <w:pPr>
-        <w:spacing w:after="80"/>
-        <w:rPr>
-          <w:b/>
+      <m:oMath>
+        <m:r>
+          <w:rPr>
+            <w:rFonts w:ascii="Cambria Math" w:hAnsi="Cambria Math"/>
+            <w:color w:val="EE0000"/>
+            <w:sz w:val="23"/>
+          </w:rPr>
+          <m:t>10∙</m:t>
+        </m:r>
+        <m:r>
+          <w:rPr>
+            <w:rFonts w:ascii="Cambria Math" w:hAnsi="Cambria Math"/>
+            <w:color w:val="EE0000"/>
+            <w:sz w:val="23"/>
+          </w:rPr>
+          <m:t>6.02+1.76=61.96</m:t>
+        </m:r>
+      </m:oMath>
+      <w:r>
+        <w:rPr>
+          <w:rFonts w:eastAsiaTheme="minorEastAsia"/>
+          <w:bCs/>
+          <w:color w:val="EE0000"/>
           <w:sz w:val="23"/>
         </w:rPr>
-      </w:pPr>
-      <w:r>
-        <w:rPr>
-          <w:rFonts w:eastAsiaTheme="minorEastAsia" w:cstheme="minorHAnsi"/>
-          <w:b/>
-        </w:rPr>
-        <w:t>6</w:t>
-      </w:r>
-      <w:r>
-        <w:rPr>
-          <w:rFonts w:eastAsiaTheme="minorEastAsia" w:cstheme="minorHAnsi"/>
-          <w:b/>
-        </w:rPr>
-        <w:t xml:space="preserve">. </w:t>
-      </w:r>
-      <w:r>
-        <w:rPr>
-          <w:b/>
-          <w:sz w:val="23"/>
-        </w:rPr>
-        <w:t>Quantization</w:t>
-      </w:r>
-    </w:p>
-    <w:p>
-      <w:pPr>
-        <w:spacing w:after="80"/>
-        <w:rPr>
-          <w:bCs/>
-          <w:sz w:val="23"/>
-        </w:rPr>
-      </w:pPr>
-      <w:r>
-        <w:rPr>
-          <w:bCs/>
-          <w:sz w:val="23"/>
-        </w:rPr>
-        <w:t>Estimate the ideal full-scale sine SQNR for a 10-bit uniform quantizer.</w:t>
+        <w:t xml:space="preserve"> dB</w:t>
       </w:r>
     </w:p>
     <w:sectPr>

</xml_diff>